<commit_message>
Updated email contact information across multiple pages, removed outdated database documentation, and refined the Build Guide and Design Style Guide for clarity.
</commit_message>
<xml_diff>
--- a/Documentation/Build Guide and Considerations.docx
+++ b/Documentation/Build Guide and Considerations.docx
@@ -95,7 +95,15 @@
         </w:numPr>
       </w:pPr>
       <w:r>
-        <w:t>Configure the database to the specifications listed in the Database_Instructions file.</w:t>
+        <w:t xml:space="preserve">Configure the database to the specifications listed in the </w:t>
+      </w:r>
+      <w:proofErr w:type="spellStart"/>
+      <w:r>
+        <w:t>Database_Instructions</w:t>
+      </w:r>
+      <w:proofErr w:type="spellEnd"/>
+      <w:r>
+        <w:t xml:space="preserve"> file.</w:t>
       </w:r>
     </w:p>
     <w:p>
@@ -106,7 +114,15 @@
         </w:numPr>
       </w:pPr>
       <w:r>
-        <w:t>Place the site directory where the web server can access it (e.g., htdocs in a XAMPP setup).</w:t>
+        <w:t xml:space="preserve">Place the site directory where the web server can access it (e.g., </w:t>
+      </w:r>
+      <w:proofErr w:type="spellStart"/>
+      <w:r>
+        <w:t>htdocs</w:t>
+      </w:r>
+      <w:proofErr w:type="spellEnd"/>
+      <w:r>
+        <w:t xml:space="preserve"> in a XAMPP setup).</w:t>
       </w:r>
     </w:p>
     <w:p>
@@ -117,13 +133,19 @@
         </w:numPr>
       </w:pPr>
       <w:r>
-        <w:t>Navigate to the site directory containing index.php</w:t>
-      </w:r>
-    </w:p>
-    <w:p>
-      <w:pPr>
+        <w:t xml:space="preserve">Navigate to the site directory containing </w:t>
+      </w:r>
+      <w:proofErr w:type="spellStart"/>
+      <w:r>
+        <w:t>index.php</w:t>
+      </w:r>
+      <w:proofErr w:type="spellEnd"/>
+    </w:p>
+    <w:p>
+      <w:pPr>
+        <w:pStyle w:val="ListParagraph"/>
         <w:numPr>
-          <w:ilvl w:val="1"/>
+          <w:ilvl w:val="2"/>
           <w:numId w:val="2"/>
         </w:numPr>
       </w:pPr>
@@ -214,7 +236,15 @@
         </w:numPr>
       </w:pPr>
       <w:r>
-        <w:t>The database should be configured with naming and tables detailed in the Database_Instructions file.</w:t>
+        <w:t xml:space="preserve">The database should be configured with naming and tables detailed in the </w:t>
+      </w:r>
+      <w:proofErr w:type="spellStart"/>
+      <w:r>
+        <w:t>Database_Instructions</w:t>
+      </w:r>
+      <w:proofErr w:type="spellEnd"/>
+      <w:r>
+        <w:t xml:space="preserve"> file.</w:t>
       </w:r>
     </w:p>
     <w:p>
@@ -224,8 +254,21 @@
           <w:numId w:val="4"/>
         </w:numPr>
       </w:pPr>
-      <w:r>
-        <w:t>DDL.sql and DML.sql are provided to assist with database recreation.</w:t>
+      <w:proofErr w:type="spellStart"/>
+      <w:r>
+        <w:t>DDL.sql</w:t>
+      </w:r>
+      <w:proofErr w:type="spellEnd"/>
+      <w:r>
+        <w:t xml:space="preserve"> and </w:t>
+      </w:r>
+      <w:proofErr w:type="spellStart"/>
+      <w:r>
+        <w:t>DML.sql</w:t>
+      </w:r>
+      <w:proofErr w:type="spellEnd"/>
+      <w:r>
+        <w:t xml:space="preserve"> are provided to assist with database recreation.</w:t>
       </w:r>
     </w:p>
     <w:p>
@@ -247,31 +290,23 @@
         </w:numPr>
       </w:pPr>
       <w:r>
-        <w:t>The connector.php file in the scripts directory contains the configuration for the database connection. It is currently configured with the default settings for a XAMPP MySQL database.</w:t>
-      </w:r>
-    </w:p>
-    <w:p/>
-    <w:p>
-      <w:r>
-        <w:pict w14:anchorId="36E0EB31">
-          <v:rect id="_x0000_i1028" style="width:0;height:1.5pt" o:hralign="center" o:hrstd="t" o:hrnoshade="t" o:hr="t" fillcolor="#ccc" stroked="f"/>
-        </w:pict>
-      </w:r>
-    </w:p>
-    <w:p>
-      <w:r>
-        <w:t>Jonathan Latkowcer</w:t>
-      </w:r>
-      <w:r>
-        <w:br/>
-        <w:t>Team Leader</w:t>
-      </w:r>
-      <w:r>
-        <w:br/>
-        <w:t>booked development team</w:t>
-      </w:r>
-    </w:p>
-    <w:p/>
+        <w:t xml:space="preserve">The </w:t>
+      </w:r>
+      <w:proofErr w:type="spellStart"/>
+      <w:r>
+        <w:t>connector.php</w:t>
+      </w:r>
+      <w:proofErr w:type="spellEnd"/>
+      <w:r>
+        <w:t xml:space="preserve"> file in the scripts directory contains the configuration for the database connection. It is currently configured with the default settings for </w:t>
+      </w:r>
+      <w:r>
+        <w:t>the</w:t>
+      </w:r>
+      <w:r>
+        <w:t xml:space="preserve"> XAMPP MySQL database.</w:t>
+      </w:r>
+    </w:p>
     <w:sectPr>
       <w:headerReference w:type="default" r:id="rId7"/>
       <w:pgSz w:w="12240" w:h="15840"/>
@@ -808,7 +843,7 @@
   <w:abstractNum w:abstractNumId="3" w15:restartNumberingAfterBreak="0">
     <w:nsid w:val="77A43042"/>
     <w:multiLevelType w:val="multilevel"/>
-    <w:tmpl w:val="3DA06BC8"/>
+    <w:tmpl w:val="D43CAF46"/>
     <w:lvl w:ilvl="0">
       <w:start w:val="1"/>
       <w:numFmt w:val="decimal"/>
@@ -833,17 +868,16 @@
         <w:ind w:left="1440" w:hanging="360"/>
       </w:pPr>
     </w:lvl>
-    <w:lvl w:ilvl="2" w:tentative="1">
-      <w:start w:val="1"/>
-      <w:numFmt w:val="decimal"/>
-      <w:lvlText w:val="%3."/>
-      <w:lvlJc w:val="left"/>
-      <w:pPr>
-        <w:tabs>
-          <w:tab w:val="num" w:pos="2160"/>
-        </w:tabs>
+    <w:lvl w:ilvl="2">
+      <w:numFmt w:val="bullet"/>
+      <w:lvlText w:val="-"/>
+      <w:lvlJc w:val="left"/>
+      <w:pPr>
         <w:ind w:left="2160" w:hanging="360"/>
       </w:pPr>
+      <w:rPr>
+        <w:rFonts w:ascii="Aptos" w:eastAsiaTheme="minorHAnsi" w:hAnsi="Aptos" w:cstheme="minorBidi" w:hint="default"/>
+      </w:rPr>
     </w:lvl>
     <w:lvl w:ilvl="3" w:tentative="1">
       <w:start w:val="1"/>

</xml_diff>